<commit_message>
Se agregan mis certificaciones en la section Acerca de
</commit_message>
<xml_diff>
--- a/static/CV_Junior_Dev_Kevin_Olivella.docx
+++ b/static/CV_Junior_Dev_Kevin_Olivella.docx
@@ -228,7 +228,7 @@
         <w:rPr>
           <w:lang w:val="es-CO"/>
         </w:rPr>
-        <w:t>Perfil Profesional</w:t>
+        <w:t xml:space="preserve">Perfil </w:t>
       </w:r>
     </w:p>
     <w:p>
@@ -242,7 +242,7 @@
         <w:rPr>
           <w:lang w:val="es-CO"/>
         </w:rPr>
-        <w:t xml:space="preserve">Técnico en formación en Asistencia en Desarrollo de Software, con sólida base en desarrollo de software con Java, Spring </w:t>
+        <w:t xml:space="preserve">formación en Asistencia en Desarrollo de Software, con sólida base en desarrollo de software con Java, Spring </w:t>
       </w:r>
       <w:proofErr w:type="spellStart"/>
       <w:r>
@@ -814,26 +814,104 @@
     <w:p>
       <w:pPr>
         <w:pStyle w:val="Ttulo2"/>
+        <w:rPr>
+          <w:lang w:val="es-CO"/>
+        </w:rPr>
+      </w:pPr>
+      <w:r>
+        <w:rPr>
+          <w:lang w:val="es-CO"/>
+        </w:rPr>
+        <w:t>Experiencia en Proyectos</w:t>
+      </w:r>
+    </w:p>
+    <w:p>
+      <w:pPr>
+        <w:rPr>
+          <w:lang w:val="es-CO"/>
+        </w:rPr>
       </w:pPr>
       <w:proofErr w:type="spellStart"/>
       <w:r>
-        <w:t>Experiencia</w:t>
+        <w:rPr>
+          <w:lang w:val="es-CO"/>
+        </w:rPr>
+        <w:t>Evaluapp</w:t>
       </w:r>
       <w:proofErr w:type="spellEnd"/>
       <w:r>
-        <w:t xml:space="preserve"> </w:t>
+        <w:rPr>
+          <w:lang w:val="es-CO"/>
+        </w:rPr>
+        <w:t xml:space="preserve"> – Sistema de evaluación en línea</w:t>
+      </w:r>
+    </w:p>
+    <w:p>
+      <w:pPr>
+        <w:rPr>
+          <w:lang w:val="es-CO"/>
+        </w:rPr>
+      </w:pPr>
+      <w:r>
+        <w:rPr>
+          <w:lang w:val="es-CO"/>
+        </w:rPr>
+        <w:t xml:space="preserve">Tecnologías: Java, Spring </w:t>
       </w:r>
       <w:proofErr w:type="spellStart"/>
       <w:r>
-        <w:t>en</w:t>
+        <w:rPr>
+          <w:lang w:val="es-CO"/>
+        </w:rPr>
+        <w:t>Boot</w:t>
       </w:r>
       <w:proofErr w:type="spellEnd"/>
       <w:r>
-        <w:t xml:space="preserve"> </w:t>
+        <w:rPr>
+          <w:lang w:val="es-CO"/>
+        </w:rPr>
+        <w:t xml:space="preserve">, </w:t>
       </w:r>
       <w:proofErr w:type="spellStart"/>
       <w:r>
-        <w:t>Proyectos</w:t>
+        <w:rPr>
+          <w:lang w:val="es-CO"/>
+        </w:rPr>
+        <w:t>Hibernate</w:t>
+      </w:r>
+      <w:proofErr w:type="spellEnd"/>
+      <w:r>
+        <w:rPr>
+          <w:lang w:val="es-CO"/>
+        </w:rPr>
+        <w:t>, MySQL</w:t>
+      </w:r>
+      <w:r>
+        <w:rPr>
+          <w:lang w:val="es-CO"/>
+        </w:rPr>
+        <w:t xml:space="preserve"> y </w:t>
+      </w:r>
+      <w:proofErr w:type="spellStart"/>
+      <w:r>
+        <w:rPr>
+          <w:lang w:val="es-CO"/>
+        </w:rPr>
+        <w:t>React</w:t>
+      </w:r>
+      <w:proofErr w:type="spellEnd"/>
+      <w:r>
+        <w:rPr>
+          <w:lang w:val="es-CO"/>
+        </w:rPr>
+        <w:t xml:space="preserve"> para el </w:t>
+      </w:r>
+      <w:proofErr w:type="spellStart"/>
+      <w:r>
+        <w:rPr>
+          <w:lang w:val="es-CO"/>
+        </w:rPr>
+        <w:t>frontend</w:t>
       </w:r>
       <w:proofErr w:type="spellEnd"/>
     </w:p>
@@ -843,19 +921,65 @@
           <w:lang w:val="es-CO"/>
         </w:rPr>
       </w:pPr>
+      <w:r>
+        <w:rPr>
+          <w:lang w:val="es-CO"/>
+        </w:rPr>
+        <w:t xml:space="preserve">- Desarrollo </w:t>
+      </w:r>
       <w:proofErr w:type="spellStart"/>
       <w:r>
         <w:rPr>
           <w:lang w:val="es-CO"/>
         </w:rPr>
-        <w:t>Evaluapp</w:t>
+        <w:t>backend</w:t>
       </w:r>
       <w:proofErr w:type="spellEnd"/>
       <w:r>
         <w:rPr>
           <w:lang w:val="es-CO"/>
         </w:rPr>
-        <w:t xml:space="preserve"> – Sistema de evaluación en línea</w:t>
+        <w:t xml:space="preserve"> de entidades, relaciones y lógica de negocio</w:t>
+      </w:r>
+      <w:r>
+        <w:rPr>
+          <w:lang w:val="es-CO"/>
+        </w:rPr>
+        <w:br/>
+        <w:t xml:space="preserve">- Implementación de seguridad con control de roles </w:t>
+      </w:r>
+      <w:r>
+        <w:rPr>
+          <w:lang w:val="es-CO"/>
+        </w:rPr>
+        <w:br/>
+        <w:t>- Simulación de pruebas manuales de caja negra</w:t>
+      </w:r>
+      <w:r>
+        <w:rPr>
+          <w:lang w:val="es-CO"/>
+        </w:rPr>
+        <w:br/>
+        <w:t>- Construcción de flujo completo: creación y resolución de exámenes</w:t>
+      </w:r>
+    </w:p>
+    <w:p>
+      <w:pPr>
+        <w:rPr>
+          <w:lang w:val="es-CO"/>
+        </w:rPr>
+      </w:pPr>
+      <w:r>
+        <w:rPr>
+          <w:lang w:val="es-CO"/>
+        </w:rPr>
+        <w:t xml:space="preserve">Tienda Virtual – </w:t>
+      </w:r>
+      <w:r>
+        <w:rPr>
+          <w:lang w:val="es-CO"/>
+        </w:rPr>
+        <w:t>Plataforma de compras en línea con pasarela de pagos</w:t>
       </w:r>
     </w:p>
     <w:p>
@@ -865,18 +989,35 @@
       </w:r>
       <w:proofErr w:type="spellEnd"/>
       <w:r>
-        <w:t>: Java, Spring Boot, Hibernate, MySQL</w:t>
-      </w:r>
-      <w:r>
-        <w:t xml:space="preserve"> y React para </w:t>
+        <w:t xml:space="preserve">: Typescript, </w:t>
       </w:r>
       <w:proofErr w:type="spellStart"/>
       <w:r>
-        <w:t>el</w:t>
+        <w:t>Javascrip</w:t>
       </w:r>
       <w:proofErr w:type="spellEnd"/>
       <w:r>
-        <w:t xml:space="preserve"> frontend</w:t>
+        <w:t xml:space="preserve">, </w:t>
+      </w:r>
+      <w:proofErr w:type="spellStart"/>
+      <w:r>
+        <w:t>Nest</w:t>
+      </w:r>
+      <w:r>
+        <w:t>JS</w:t>
+      </w:r>
+      <w:proofErr w:type="spellEnd"/>
+      <w:r>
+        <w:t>, React,</w:t>
+      </w:r>
+      <w:r>
+        <w:t xml:space="preserve"> Vite,</w:t>
+      </w:r>
+      <w:r>
+        <w:t xml:space="preserve"> Post</w:t>
+      </w:r>
+      <w:r>
+        <w:t>greSQL, Tailwind CSS.</w:t>
       </w:r>
     </w:p>
     <w:p>
@@ -889,179 +1030,62 @@
         <w:rPr>
           <w:lang w:val="es-CO"/>
         </w:rPr>
-        <w:t xml:space="preserve">- Desarrollo </w:t>
+        <w:t>-</w:t>
+      </w:r>
+      <w:r>
+        <w:rPr>
+          <w:rFonts w:ascii="Times New Roman" w:eastAsia="Times New Roman" w:hAnsi="Symbol" w:cs="Times New Roman"/>
+          <w:sz w:val="24"/>
+          <w:szCs w:val="24"/>
+          <w:lang w:val="es-CO" w:eastAsia="es-CO"/>
+        </w:rPr>
+        <w:t xml:space="preserve"> </w:t>
+      </w:r>
+      <w:r>
+        <w:rPr>
+          <w:lang w:val="es-CO"/>
+        </w:rPr>
+        <w:t xml:space="preserve"> Desarrollo </w:t>
       </w:r>
       <w:proofErr w:type="spellStart"/>
       <w:r>
         <w:rPr>
           <w:lang w:val="es-CO"/>
         </w:rPr>
-        <w:t>backend</w:t>
+        <w:t>fullstack</w:t>
       </w:r>
       <w:proofErr w:type="spellEnd"/>
       <w:r>
         <w:rPr>
           <w:lang w:val="es-CO"/>
         </w:rPr>
-        <w:t xml:space="preserve"> de entidades, relaciones y lógica de negocio</w:t>
-      </w:r>
-      <w:r>
-        <w:rPr>
-          <w:lang w:val="es-CO"/>
-        </w:rPr>
-        <w:br/>
-        <w:t>- Implementación de seguridad con control de roles (TEACHER / STUDENT)</w:t>
-      </w:r>
-      <w:r>
-        <w:rPr>
-          <w:lang w:val="es-CO"/>
-        </w:rPr>
-        <w:br/>
-        <w:t>- Simulación de pruebas manuales de caja negra</w:t>
-      </w:r>
-      <w:r>
-        <w:rPr>
-          <w:lang w:val="es-CO"/>
-        </w:rPr>
-        <w:br/>
-        <w:t xml:space="preserve">- Construcción de flujo completo: </w:t>
+        <w:t xml:space="preserve"> con integración a </w:t>
       </w:r>
       <w:proofErr w:type="spellStart"/>
       <w:r>
         <w:rPr>
           <w:lang w:val="es-CO"/>
         </w:rPr>
-        <w:t>login</w:t>
+        <w:t>Wompi</w:t>
       </w:r>
       <w:proofErr w:type="spellEnd"/>
       <w:r>
         <w:rPr>
           <w:lang w:val="es-CO"/>
         </w:rPr>
-        <w:t>, creación y resolución de exámenes</w:t>
-      </w:r>
-    </w:p>
-    <w:p>
-      <w:pPr>
-        <w:rPr>
-          <w:lang w:val="es-CO"/>
-        </w:rPr>
-      </w:pPr>
-      <w:r>
-        <w:rPr>
-          <w:lang w:val="es-CO"/>
-        </w:rPr>
-        <w:t>Sistema de Gestión de Empleados</w:t>
-      </w:r>
-    </w:p>
-    <w:p>
-      <w:pPr>
-        <w:rPr>
-          <w:lang w:val="es-CO"/>
-        </w:rPr>
-      </w:pPr>
-      <w:r>
-        <w:rPr>
-          <w:lang w:val="es-CO"/>
-        </w:rPr>
-        <w:t xml:space="preserve">Tecnologías: Angular 17, </w:t>
+        <w:t xml:space="preserve"> en modo </w:t>
       </w:r>
       <w:proofErr w:type="spellStart"/>
       <w:r>
         <w:rPr>
           <w:lang w:val="es-CO"/>
         </w:rPr>
-        <w:t>PrimeNG</w:t>
-      </w:r>
-      <w:proofErr w:type="spellEnd"/>
-      <w:r>
-        <w:rPr>
-          <w:lang w:val="es-CO"/>
-        </w:rPr>
-        <w:t xml:space="preserve">, Spring </w:t>
-      </w:r>
-      <w:proofErr w:type="spellStart"/>
-      <w:r>
-        <w:rPr>
-          <w:lang w:val="es-CO"/>
-        </w:rPr>
-        <w:t>Boot</w:t>
-      </w:r>
-      <w:proofErr w:type="spellEnd"/>
-      <w:r>
-        <w:rPr>
-          <w:lang w:val="es-CO"/>
-        </w:rPr>
-        <w:t>, JWT, MySQL</w:t>
-      </w:r>
-    </w:p>
-    <w:p>
-      <w:pPr>
-        <w:rPr>
-          <w:lang w:val="es-CO"/>
-        </w:rPr>
-      </w:pPr>
-      <w:r>
-        <w:rPr>
-          <w:lang w:val="es-CO"/>
-        </w:rPr>
-        <w:t>- Construcción de CRUD completo con validaciones de formularios</w:t>
-      </w:r>
-      <w:r>
-        <w:rPr>
-          <w:lang w:val="es-CO"/>
-        </w:rPr>
-        <w:br/>
-        <w:t xml:space="preserve">- Uso de rutas protegidas, servicios y componentes </w:t>
-      </w:r>
-      <w:proofErr w:type="spellStart"/>
-      <w:r>
-        <w:rPr>
-          <w:lang w:val="es-CO"/>
-        </w:rPr>
-        <w:t>standalone</w:t>
-      </w:r>
-      <w:proofErr w:type="spellEnd"/>
-      <w:r>
-        <w:rPr>
-          <w:lang w:val="es-CO"/>
-        </w:rPr>
-        <w:br/>
-        <w:t>- Pruebas manuales para verificación de errores, validaciones y visualización</w:t>
-      </w:r>
-      <w:r>
-        <w:rPr>
-          <w:lang w:val="es-CO"/>
-        </w:rPr>
-        <w:br/>
-        <w:t xml:space="preserve">- Uso de herramientas como </w:t>
-      </w:r>
-      <w:proofErr w:type="spellStart"/>
-      <w:r>
-        <w:rPr>
-          <w:lang w:val="es-CO"/>
-        </w:rPr>
-        <w:t>Postman</w:t>
-      </w:r>
-      <w:proofErr w:type="spellEnd"/>
-      <w:r>
-        <w:rPr>
-          <w:lang w:val="es-CO"/>
-        </w:rPr>
-        <w:t xml:space="preserve"> para pruebas básicas de </w:t>
-      </w:r>
-      <w:proofErr w:type="spellStart"/>
-      <w:r>
-        <w:rPr>
-          <w:lang w:val="es-CO"/>
-        </w:rPr>
-        <w:t>APIs</w:t>
+        <w:t>sandbox</w:t>
       </w:r>
       <w:proofErr w:type="spellEnd"/>
     </w:p>
     <w:p>
       <w:pPr>
-        <w:pStyle w:val="Ttulo2"/>
         <w:rPr>
           <w:lang w:val="es-CO"/>
         </w:rPr>
@@ -1070,7 +1094,13 @@
         <w:rPr>
           <w:lang w:val="es-CO"/>
         </w:rPr>
-        <w:t>Educación</w:t>
+        <w:t>-</w:t>
+      </w:r>
+      <w:r>
+        <w:rPr>
+          <w:lang w:val="es-CO"/>
+        </w:rPr>
+        <w:t xml:space="preserve">  Registro y visualización de transacciones en tiempo real</w:t>
       </w:r>
     </w:p>
     <w:p>
@@ -1083,7 +1113,13 @@
         <w:rPr>
           <w:lang w:val="es-CO"/>
         </w:rPr>
-        <w:t>Técnico en Asistencia en Desarrollo de Software</w:t>
+        <w:t xml:space="preserve">- </w:t>
+      </w:r>
+      <w:r>
+        <w:rPr>
+          <w:lang w:val="es-CO"/>
+        </w:rPr>
+        <w:t>Interfaz responsive con experiencia de usuario optimizada</w:t>
       </w:r>
     </w:p>
     <w:p>
@@ -1092,25 +1128,17 @@
           <w:lang w:val="es-CO"/>
         </w:rPr>
       </w:pPr>
-      <w:proofErr w:type="spellStart"/>
-      <w:r>
-        <w:rPr>
-          <w:lang w:val="es-CO"/>
-        </w:rPr>
-        <w:t>Cesde</w:t>
-      </w:r>
-      <w:proofErr w:type="spellEnd"/>
-      <w:r>
-        <w:rPr>
-          <w:lang w:val="es-CO"/>
-        </w:rPr>
-        <w:t>, Sede Bello, Antioquia</w:t>
-      </w:r>
-      <w:r>
-        <w:rPr>
-          <w:lang w:val="es-CO"/>
-        </w:rPr>
-        <w:t xml:space="preserve"> – En curso</w:t>
+      <w:r>
+        <w:rPr>
+          <w:lang w:val="es-CO"/>
+        </w:rPr>
+        <w:t>-</w:t>
+      </w:r>
+      <w:r>
+        <w:rPr>
+          <w:lang w:val="es-CO"/>
+        </w:rPr>
+        <w:t xml:space="preserve">  Implementación de pagos simulados, validación de tarjetas y resúmenes de compra</w:t>
       </w:r>
     </w:p>
     <w:p>
@@ -1123,7 +1151,69 @@
         <w:rPr>
           <w:lang w:val="es-CO"/>
         </w:rPr>
-        <w:t>Certificaciones:</w:t>
+        <w:t>-</w:t>
+      </w:r>
+      <w:r>
+        <w:rPr>
+          <w:lang w:val="es-CO"/>
+        </w:rPr>
+        <w:t xml:space="preserve">  Despliegue en </w:t>
+      </w:r>
+      <w:proofErr w:type="spellStart"/>
+      <w:r>
+        <w:rPr>
+          <w:lang w:val="es-CO"/>
+        </w:rPr>
+        <w:t>Vercel</w:t>
+      </w:r>
+      <w:proofErr w:type="spellEnd"/>
+      <w:r>
+        <w:rPr>
+          <w:lang w:val="es-CO"/>
+        </w:rPr>
+        <w:t xml:space="preserve"> y </w:t>
+      </w:r>
+      <w:proofErr w:type="spellStart"/>
+      <w:r>
+        <w:rPr>
+          <w:lang w:val="es-CO"/>
+        </w:rPr>
+        <w:t>Netlify</w:t>
+      </w:r>
+      <w:proofErr w:type="spellEnd"/>
+      <w:r>
+        <w:rPr>
+          <w:lang w:val="es-CO"/>
+        </w:rPr>
+        <w:t xml:space="preserve"> (</w:t>
+      </w:r>
+      <w:proofErr w:type="spellStart"/>
+      <w:r>
+        <w:rPr>
+          <w:lang w:val="es-CO"/>
+        </w:rPr>
+        <w:t>frontend</w:t>
+      </w:r>
+      <w:proofErr w:type="spellEnd"/>
+      <w:r>
+        <w:rPr>
+          <w:lang w:val="es-CO"/>
+        </w:rPr>
+        <w:t>) y Render (</w:t>
+      </w:r>
+      <w:proofErr w:type="spellStart"/>
+      <w:r>
+        <w:rPr>
+          <w:lang w:val="es-CO"/>
+        </w:rPr>
+        <w:t>backend</w:t>
+      </w:r>
+      <w:proofErr w:type="spellEnd"/>
+      <w:r>
+        <w:rPr>
+          <w:lang w:val="es-CO"/>
+        </w:rPr>
+        <w:t>), con pruebas automatizadas</w:t>
       </w:r>
     </w:p>
     <w:p>
@@ -1136,7 +1226,99 @@
         <w:rPr>
           <w:lang w:val="es-CO"/>
         </w:rPr>
-        <w:t xml:space="preserve">• Curso de Scrum – </w:t>
+        <w:t xml:space="preserve"> </w:t>
+      </w:r>
+    </w:p>
+    <w:p>
+      <w:pPr>
+        <w:pStyle w:val="Ttulo2"/>
+        <w:rPr>
+          <w:lang w:val="es-CO"/>
+        </w:rPr>
+      </w:pPr>
+      <w:r>
+        <w:rPr>
+          <w:lang w:val="es-CO"/>
+        </w:rPr>
+        <w:t>Educación</w:t>
+      </w:r>
+    </w:p>
+    <w:p>
+      <w:pPr>
+        <w:rPr>
+          <w:lang w:val="es-CO"/>
+        </w:rPr>
+      </w:pPr>
+      <w:r>
+        <w:rPr>
+          <w:lang w:val="es-CO"/>
+        </w:rPr>
+        <w:t>Técnico en Asistencia en Desarrollo de Software</w:t>
+      </w:r>
+    </w:p>
+    <w:p>
+      <w:pPr>
+        <w:rPr>
+          <w:lang w:val="es-CO"/>
+        </w:rPr>
+      </w:pPr>
+      <w:proofErr w:type="spellStart"/>
+      <w:r>
+        <w:rPr>
+          <w:lang w:val="es-CO"/>
+        </w:rPr>
+        <w:t>Cesde</w:t>
+      </w:r>
+      <w:proofErr w:type="spellEnd"/>
+      <w:r>
+        <w:rPr>
+          <w:lang w:val="es-CO"/>
+        </w:rPr>
+        <w:t>, Sede Bello, Antioquia</w:t>
+      </w:r>
+      <w:r>
+        <w:rPr>
+          <w:lang w:val="es-CO"/>
+        </w:rPr>
+        <w:t xml:space="preserve"> </w:t>
+      </w:r>
+    </w:p>
+    <w:p>
+      <w:pPr>
+        <w:rPr>
+          <w:lang w:val="es-CO"/>
+        </w:rPr>
+      </w:pPr>
+      <w:r>
+        <w:rPr>
+          <w:lang w:val="es-CO"/>
+        </w:rPr>
+        <w:t>Certificaciones:</w:t>
+      </w:r>
+    </w:p>
+    <w:p>
+      <w:pPr>
+        <w:rPr>
+          <w:lang w:val="es-CO"/>
+        </w:rPr>
+      </w:pPr>
+      <w:r>
+        <w:rPr>
+          <w:lang w:val="es-CO"/>
+        </w:rPr>
+        <w:t xml:space="preserve"> </w:t>
+      </w:r>
+      <w:r>
+        <w:rPr>
+          <w:lang w:val="es-CO"/>
+        </w:rPr>
+        <w:t>-</w:t>
+      </w:r>
+      <w:r>
+        <w:rPr>
+          <w:lang w:val="es-CO"/>
+        </w:rPr>
+        <w:t xml:space="preserve">Curso de Scrum – </w:t>
       </w:r>
       <w:proofErr w:type="spellStart"/>
       <w:r>
@@ -1157,7 +1339,13 @@
         <w:rPr>
           <w:lang w:val="es-CO"/>
         </w:rPr>
-        <w:t xml:space="preserve">• Curso de HTML y CSS – </w:t>
+        <w:t xml:space="preserve">- </w:t>
+      </w:r>
+      <w:r>
+        <w:rPr>
+          <w:lang w:val="es-CO"/>
+        </w:rPr>
+        <w:t xml:space="preserve">Curso de HTML y CSS – </w:t>
       </w:r>
       <w:proofErr w:type="spellStart"/>
       <w:r>
@@ -1170,21 +1358,67 @@
     </w:p>
     <w:p>
       <w:pPr>
+        <w:rPr>
+          <w:lang w:val="es-CO"/>
+        </w:rPr>
+      </w:pPr>
+      <w:r>
+        <w:rPr>
+          <w:lang w:val="es-CO"/>
+        </w:rPr>
+        <w:t xml:space="preserve">-Curso de </w:t>
+      </w:r>
+      <w:proofErr w:type="spellStart"/>
+      <w:r>
+        <w:rPr>
+          <w:lang w:val="es-CO"/>
+        </w:rPr>
+        <w:t>React</w:t>
+      </w:r>
+      <w:proofErr w:type="spellEnd"/>
+      <w:r>
+        <w:rPr>
+          <w:lang w:val="es-CO"/>
+        </w:rPr>
+        <w:t xml:space="preserve"> - </w:t>
+      </w:r>
+      <w:proofErr w:type="spellStart"/>
+      <w:r>
+        <w:rPr>
+          <w:lang w:val="es-CO"/>
+        </w:rPr>
+        <w:t>Platzi</w:t>
+      </w:r>
+      <w:proofErr w:type="spellEnd"/>
+    </w:p>
+    <w:p>
+      <w:pPr>
+        <w:rPr>
+          <w:lang w:val="es-CO"/>
+        </w:rPr>
+      </w:pPr>
+    </w:p>
+    <w:p>
+      <w:pPr>
+        <w:rPr>
+          <w:lang w:val="es-CO"/>
+        </w:rPr>
+      </w:pPr>
+    </w:p>
+    <w:p>
+      <w:pPr>
         <w:pStyle w:val="Ttulo2"/>
+        <w:rPr>
+          <w:lang w:val="es-CO"/>
+        </w:rPr>
       </w:pPr>
-      <w:proofErr w:type="spellStart"/>
-      <w:r>
-        <w:t>Información</w:t>
-      </w:r>
-      <w:proofErr w:type="spellEnd"/>
-      <w:r>
-        <w:t xml:space="preserve"> </w:t>
-      </w:r>
-      <w:proofErr w:type="spellStart"/>
-      <w:r>
-        <w:t>Adicional</w:t>
-      </w:r>
-      <w:proofErr w:type="spellEnd"/>
+      <w:r>
+        <w:rPr>
+          <w:lang w:val="es-CO"/>
+        </w:rPr>
+        <w:lastRenderedPageBreak/>
+        <w:t>Información Adicional</w:t>
+      </w:r>
     </w:p>
     <w:p>
       <w:pPr>
@@ -1232,25 +1466,15 @@
           <w:numId w:val="0"/>
         </w:numPr>
         <w:ind w:left="360"/>
+        <w:rPr>
+          <w:lang w:val="es-CO"/>
+        </w:rPr>
       </w:pPr>
       <w:r>
-        <w:t xml:space="preserve">• </w:t>
-      </w:r>
-      <w:proofErr w:type="spellStart"/>
-      <w:r>
-        <w:t>Disponibilidad</w:t>
-      </w:r>
-      <w:proofErr w:type="spellEnd"/>
-      <w:r>
-        <w:t xml:space="preserve"> </w:t>
-      </w:r>
-      <w:proofErr w:type="spellStart"/>
-      <w:r>
-        <w:t>inmediata</w:t>
-      </w:r>
-      <w:proofErr w:type="spellEnd"/>
-      <w:r>
-        <w:t xml:space="preserve"> para tiempo completo</w:t>
+        <w:rPr>
+          <w:lang w:val="es-CO"/>
+        </w:rPr>
+        <w:t>• Disponibilidad inmediata para tiempo completo</w:t>
       </w:r>
     </w:p>
     <w:p>
@@ -1437,7 +1661,7 @@
   <w:abstractNum w:abstractNumId="8" w15:restartNumberingAfterBreak="0">
     <w:nsid w:val="FFFFFF89"/>
     <w:multiLevelType w:val="singleLevel"/>
-    <w:tmpl w:val="29761A62"/>
+    <w:tmpl w:val="A94A10EE"/>
     <w:lvl w:ilvl="0">
       <w:start w:val="1"/>
       <w:numFmt w:val="bullet"/>
@@ -1601,6 +1825,119 @@
       <w:rPr>
         <w:rFonts w:ascii="Wingdings" w:hAnsi="Wingdings" w:hint="default"/>
         <w:sz w:val="20"/>
+      </w:rPr>
+    </w:lvl>
+  </w:abstractNum>
+  <w:abstractNum w:abstractNumId="10" w15:restartNumberingAfterBreak="0">
+    <w:nsid w:val="5D083787"/>
+    <w:multiLevelType w:val="hybridMultilevel"/>
+    <w:tmpl w:val="FA809894"/>
+    <w:lvl w:ilvl="0" w:tplc="240A0001">
+      <w:start w:val="1"/>
+      <w:numFmt w:val="bullet"/>
+      <w:lvlText w:val=""/>
+      <w:lvlJc w:val="left"/>
+      <w:pPr>
+        <w:ind w:left="720" w:hanging="360"/>
+      </w:pPr>
+      <w:rPr>
+        <w:rFonts w:ascii="Symbol" w:hAnsi="Symbol" w:hint="default"/>
+      </w:rPr>
+    </w:lvl>
+    <w:lvl w:ilvl="1" w:tplc="240A0003" w:tentative="1">
+      <w:start w:val="1"/>
+      <w:numFmt w:val="bullet"/>
+      <w:lvlText w:val="o"/>
+      <w:lvlJc w:val="left"/>
+      <w:pPr>
+        <w:ind w:left="1440" w:hanging="360"/>
+      </w:pPr>
+      <w:rPr>
+        <w:rFonts w:ascii="Courier New" w:hAnsi="Courier New" w:cs="Courier New" w:hint="default"/>
+      </w:rPr>
+    </w:lvl>
+    <w:lvl w:ilvl="2" w:tplc="240A0005" w:tentative="1">
+      <w:start w:val="1"/>
+      <w:numFmt w:val="bullet"/>
+      <w:lvlText w:val=""/>
+      <w:lvlJc w:val="left"/>
+      <w:pPr>
+        <w:ind w:left="2160" w:hanging="360"/>
+      </w:pPr>
+      <w:rPr>
+        <w:rFonts w:ascii="Wingdings" w:hAnsi="Wingdings" w:hint="default"/>
+      </w:rPr>
+    </w:lvl>
+    <w:lvl w:ilvl="3" w:tplc="240A0001" w:tentative="1">
+      <w:start w:val="1"/>
+      <w:numFmt w:val="bullet"/>
+      <w:lvlText w:val=""/>
+      <w:lvlJc w:val="left"/>
+      <w:pPr>
+        <w:ind w:left="2880" w:hanging="360"/>
+      </w:pPr>
+      <w:rPr>
+        <w:rFonts w:ascii="Symbol" w:hAnsi="Symbol" w:hint="default"/>
+      </w:rPr>
+    </w:lvl>
+    <w:lvl w:ilvl="4" w:tplc="240A0003" w:tentative="1">
+      <w:start w:val="1"/>
+      <w:numFmt w:val="bullet"/>
+      <w:lvlText w:val="o"/>
+      <w:lvlJc w:val="left"/>
+      <w:pPr>
+        <w:ind w:left="3600" w:hanging="360"/>
+      </w:pPr>
+      <w:rPr>
+        <w:rFonts w:ascii="Courier New" w:hAnsi="Courier New" w:cs="Courier New" w:hint="default"/>
+      </w:rPr>
+    </w:lvl>
+    <w:lvl w:ilvl="5" w:tplc="240A0005" w:tentative="1">
+      <w:start w:val="1"/>
+      <w:numFmt w:val="bullet"/>
+      <w:lvlText w:val=""/>
+      <w:lvlJc w:val="left"/>
+      <w:pPr>
+        <w:ind w:left="4320" w:hanging="360"/>
+      </w:pPr>
+      <w:rPr>
+        <w:rFonts w:ascii="Wingdings" w:hAnsi="Wingdings" w:hint="default"/>
+      </w:rPr>
+    </w:lvl>
+    <w:lvl w:ilvl="6" w:tplc="240A0001" w:tentative="1">
+      <w:start w:val="1"/>
+      <w:numFmt w:val="bullet"/>
+      <w:lvlText w:val=""/>
+      <w:lvlJc w:val="left"/>
+      <w:pPr>
+        <w:ind w:left="5040" w:hanging="360"/>
+      </w:pPr>
+      <w:rPr>
+        <w:rFonts w:ascii="Symbol" w:hAnsi="Symbol" w:hint="default"/>
+      </w:rPr>
+    </w:lvl>
+    <w:lvl w:ilvl="7" w:tplc="240A0003" w:tentative="1">
+      <w:start w:val="1"/>
+      <w:numFmt w:val="bullet"/>
+      <w:lvlText w:val="o"/>
+      <w:lvlJc w:val="left"/>
+      <w:pPr>
+        <w:ind w:left="5760" w:hanging="360"/>
+      </w:pPr>
+      <w:rPr>
+        <w:rFonts w:ascii="Courier New" w:hAnsi="Courier New" w:cs="Courier New" w:hint="default"/>
+      </w:rPr>
+    </w:lvl>
+    <w:lvl w:ilvl="8" w:tplc="240A0005" w:tentative="1">
+      <w:start w:val="1"/>
+      <w:numFmt w:val="bullet"/>
+      <w:lvlText w:val=""/>
+      <w:lvlJc w:val="left"/>
+      <w:pPr>
+        <w:ind w:left="6480" w:hanging="360"/>
+      </w:pPr>
+      <w:rPr>
+        <w:rFonts w:ascii="Wingdings" w:hAnsi="Wingdings" w:hint="default"/>
       </w:rPr>
     </w:lvl>
   </w:abstractNum>
@@ -1633,6 +1970,9 @@
   </w:num>
   <w:num w:numId="10" w16cid:durableId="1241985339">
     <w:abstractNumId w:val="9"/>
+  </w:num>
+  <w:num w:numId="11" w16cid:durableId="1974435773">
+    <w:abstractNumId w:val="10"/>
   </w:num>
 </w:numbering>
 </file>
@@ -13027,6 +13367,19 @@
       <w:u w:val="single"/>
     </w:rPr>
   </w:style>
+  <w:style w:type="paragraph" w:styleId="NormalWeb">
+    <w:name w:val="Normal (Web)"/>
+    <w:basedOn w:val="Normal"/>
+    <w:uiPriority w:val="99"/>
+    <w:semiHidden/>
+    <w:unhideWhenUsed/>
+    <w:rsid w:val="0013053E"/>
+    <w:rPr>
+      <w:rFonts w:ascii="Times New Roman" w:hAnsi="Times New Roman" w:cs="Times New Roman"/>
+      <w:sz w:val="24"/>
+      <w:szCs w:val="24"/>
+    </w:rPr>
+  </w:style>
 </w:styles>
 </file>
 

</xml_diff>

<commit_message>
Se agrega nexus al portafolio
</commit_message>
<xml_diff>
--- a/static/CV_Junior_Dev_Kevin_Olivella.docx
+++ b/static/CV_Junior_Dev_Kevin_Olivella.docx
@@ -226,9 +226,16 @@
       </w:pPr>
       <w:r>
         <w:rPr>
-          <w:lang w:val="es-CO"/>
-        </w:rPr>
-        <w:t xml:space="preserve">Perfil </w:t>
+          <w:color w:val="auto"/>
+          <w:lang w:val="es-CO"/>
+        </w:rPr>
+        <w:t>Perfil</w:t>
+      </w:r>
+      <w:r>
+        <w:rPr>
+          <w:lang w:val="es-CO"/>
+        </w:rPr>
+        <w:t xml:space="preserve"> </w:t>
       </w:r>
     </w:p>
     <w:p>
@@ -242,13 +249,89 @@
         <w:rPr>
           <w:lang w:val="es-CO"/>
         </w:rPr>
-        <w:t xml:space="preserve">formación en Asistencia en Desarrollo de Software, con sólida base en desarrollo de software con Java, Spring </w:t>
+        <w:t xml:space="preserve">Desarrollador </w:t>
       </w:r>
       <w:proofErr w:type="spellStart"/>
       <w:r>
         <w:rPr>
           <w:lang w:val="es-CO"/>
         </w:rPr>
+        <w:t>Fullstack</w:t>
+      </w:r>
+      <w:proofErr w:type="spellEnd"/>
+      <w:r>
+        <w:rPr>
+          <w:lang w:val="es-CO"/>
+        </w:rPr>
+        <w:t xml:space="preserve"> con experiencia en proyectos integradores que simulan entornos reales. </w:t>
+      </w:r>
+      <w:r>
+        <w:rPr>
+          <w:lang w:val="es-CO"/>
+        </w:rPr>
+        <w:t xml:space="preserve">Conocimientos sólidos en </w:t>
+      </w:r>
+      <w:proofErr w:type="spellStart"/>
+      <w:r>
+        <w:rPr>
+          <w:lang w:val="es-CO"/>
+        </w:rPr>
+        <w:t>frontend</w:t>
+      </w:r>
+      <w:proofErr w:type="spellEnd"/>
+      <w:r>
+        <w:rPr>
+          <w:lang w:val="es-CO"/>
+        </w:rPr>
+        <w:t xml:space="preserve"> (Angular, </w:t>
+      </w:r>
+      <w:proofErr w:type="spellStart"/>
+      <w:r>
+        <w:rPr>
+          <w:lang w:val="es-CO"/>
+        </w:rPr>
+        <w:t>React</w:t>
+      </w:r>
+      <w:proofErr w:type="spellEnd"/>
+      <w:r>
+        <w:rPr>
+          <w:lang w:val="es-CO"/>
+        </w:rPr>
+        <w:t xml:space="preserve">, </w:t>
+      </w:r>
+      <w:proofErr w:type="spellStart"/>
+      <w:r>
+        <w:rPr>
+          <w:lang w:val="es-CO"/>
+        </w:rPr>
+        <w:t>Tailwind</w:t>
+      </w:r>
+      <w:proofErr w:type="spellEnd"/>
+      <w:r>
+        <w:rPr>
+          <w:lang w:val="es-CO"/>
+        </w:rPr>
+        <w:t xml:space="preserve">, Bootstrap) y </w:t>
+      </w:r>
+      <w:proofErr w:type="spellStart"/>
+      <w:r>
+        <w:rPr>
+          <w:lang w:val="es-CO"/>
+        </w:rPr>
+        <w:t>backend</w:t>
+      </w:r>
+      <w:proofErr w:type="spellEnd"/>
+      <w:r>
+        <w:rPr>
+          <w:lang w:val="es-CO"/>
+        </w:rPr>
+        <w:t xml:space="preserve"> (Java, Spring </w:t>
+      </w:r>
+      <w:proofErr w:type="spellStart"/>
+      <w:r>
+        <w:rPr>
+          <w:lang w:val="es-CO"/>
+        </w:rPr>
         <w:t>Boot</w:t>
       </w:r>
       <w:proofErr w:type="spellEnd"/>
@@ -256,33 +339,77 @@
         <w:rPr>
           <w:lang w:val="es-CO"/>
         </w:rPr>
+        <w:t xml:space="preserve">, Python, MySQL, PostgreSQL). </w:t>
+      </w:r>
+      <w:r>
+        <w:rPr>
+          <w:lang w:val="es-CO"/>
+        </w:rPr>
+        <w:t xml:space="preserve">Tengo </w:t>
+      </w:r>
+      <w:r>
+        <w:rPr>
+          <w:lang w:val="es-CO"/>
+        </w:rPr>
+        <w:t>enfoque en QA y pruebas de software</w:t>
+      </w:r>
+      <w:r>
+        <w:rPr>
+          <w:lang w:val="es-CO"/>
+        </w:rPr>
         <w:t xml:space="preserve">, </w:t>
       </w:r>
+      <w:r>
+        <w:rPr>
+          <w:lang w:val="es-CO"/>
+        </w:rPr>
+        <w:t xml:space="preserve">aplicando pruebas manuales, documentación de flujos, validación de formularios y testeo de </w:t>
+      </w:r>
       <w:proofErr w:type="spellStart"/>
       <w:r>
         <w:rPr>
           <w:lang w:val="es-CO"/>
         </w:rPr>
-        <w:t>React</w:t>
+        <w:t>APIs</w:t>
       </w:r>
       <w:proofErr w:type="spellEnd"/>
       <w:r>
         <w:rPr>
           <w:lang w:val="es-CO"/>
         </w:rPr>
-        <w:t>, Python</w:t>
-      </w:r>
-      <w:r>
-        <w:rPr>
-          <w:lang w:val="es-CO"/>
-        </w:rPr>
-        <w:t xml:space="preserve"> y Angular. Experiencia en proyectos integradores que simulan entornos reales, incluyendo la construcción de </w:t>
+        <w:t xml:space="preserve"> con </w:t>
       </w:r>
       <w:proofErr w:type="spellStart"/>
       <w:r>
         <w:rPr>
           <w:lang w:val="es-CO"/>
         </w:rPr>
+        <w:t>Postman</w:t>
+      </w:r>
+      <w:proofErr w:type="spellEnd"/>
+      <w:r>
+        <w:rPr>
+          <w:lang w:val="es-CO"/>
+        </w:rPr>
+        <w:t>. Manejo de control de versiones con Git</w:t>
+      </w:r>
+      <w:r>
+        <w:rPr>
+          <w:lang w:val="es-CO"/>
+        </w:rPr>
+        <w:t xml:space="preserve">. </w:t>
+      </w:r>
+      <w:r>
+        <w:rPr>
+          <w:lang w:val="es-CO"/>
+        </w:rPr>
+        <w:t xml:space="preserve">Experiencia en construcción de </w:t>
+      </w:r>
+      <w:proofErr w:type="spellStart"/>
+      <w:r>
+        <w:rPr>
+          <w:lang w:val="es-CO"/>
+        </w:rPr>
         <w:t>CRUDs</w:t>
       </w:r>
       <w:proofErr w:type="spellEnd"/>
@@ -290,18 +417,34 @@
         <w:rPr>
           <w:lang w:val="es-CO"/>
         </w:rPr>
-        <w:t>, autenticación, control de roles y flujo completo del usuario. Con conocimientos en bases de datos relacionales, metodologías ágiles como Scrum, y motivado por el aprendizaje continuo. Busco un rol donde pueda contribuir al desarrollo de soluciones tecnológicas, mientras crezco profesionalmente en automatización y análisis de software.</w:t>
+        <w:t xml:space="preserve">, autenticación con roles, desarrollo de </w:t>
+      </w:r>
+      <w:proofErr w:type="spellStart"/>
+      <w:r>
+        <w:rPr>
+          <w:lang w:val="es-CO"/>
+        </w:rPr>
+        <w:t>APIs</w:t>
+      </w:r>
+      <w:proofErr w:type="spellEnd"/>
+      <w:r>
+        <w:rPr>
+          <w:lang w:val="es-CO"/>
+        </w:rPr>
+        <w:t xml:space="preserve"> y despliegues en la nube. Busco aportar en equipos de desarrollo aportando soluciones escalables y de calidad.</w:t>
       </w:r>
     </w:p>
     <w:p>
       <w:pPr>
         <w:pStyle w:val="Ttulo2"/>
         <w:rPr>
+          <w:color w:val="auto"/>
           <w:lang w:val="es-CO"/>
         </w:rPr>
       </w:pPr>
       <w:r>
         <w:rPr>
+          <w:color w:val="auto"/>
           <w:lang w:val="es-CO"/>
         </w:rPr>
         <w:t>Habilidades Técnicas</w:t>
@@ -380,6 +523,28 @@
         <w:t>PrimeNG</w:t>
       </w:r>
       <w:proofErr w:type="spellEnd"/>
+      <w:r>
+        <w:rPr>
+          <w:b/>
+          <w:bCs/>
+          <w:lang w:val="es-CO"/>
+        </w:rPr>
+        <w:t xml:space="preserve"> </w:t>
+      </w:r>
+      <w:r>
+        <w:rPr>
+          <w:lang w:val="es-CO"/>
+        </w:rPr>
+        <w:t xml:space="preserve">y </w:t>
+      </w:r>
+      <w:r>
+        <w:rPr>
+          <w:b/>
+          <w:bCs/>
+          <w:lang w:val="es-CO"/>
+        </w:rPr>
+        <w:t>Angular Material</w:t>
+      </w:r>
       <w:r>
         <w:rPr>
           <w:lang w:val="es-CO"/>
@@ -815,11 +980,13 @@
       <w:pPr>
         <w:pStyle w:val="Ttulo2"/>
         <w:rPr>
+          <w:color w:val="auto"/>
           <w:lang w:val="es-CO"/>
         </w:rPr>
       </w:pPr>
       <w:r>
         <w:rPr>
+          <w:color w:val="auto"/>
           <w:lang w:val="es-CO"/>
         </w:rPr>
         <w:t>Experiencia en Proyectos</w:t>
@@ -1233,11 +1400,13 @@
       <w:pPr>
         <w:pStyle w:val="Ttulo2"/>
         <w:rPr>
+          <w:color w:val="auto"/>
           <w:lang w:val="es-CO"/>
         </w:rPr>
       </w:pPr>
       <w:r>
         <w:rPr>
+          <w:color w:val="auto"/>
           <w:lang w:val="es-CO"/>
         </w:rPr>
         <w:t>Educación</w:t>
@@ -1253,7 +1422,31 @@
         <w:rPr>
           <w:lang w:val="es-CO"/>
         </w:rPr>
-        <w:t>Técnico en Asistencia en Desarrollo de Software</w:t>
+        <w:t>Técnico</w:t>
+      </w:r>
+      <w:r>
+        <w:rPr>
+          <w:lang w:val="es-CO"/>
+        </w:rPr>
+        <w:t xml:space="preserve"> laboral por competencias</w:t>
+      </w:r>
+      <w:r>
+        <w:rPr>
+          <w:lang w:val="es-CO"/>
+        </w:rPr>
+        <w:t xml:space="preserve"> en Asisten</w:t>
+      </w:r>
+      <w:r>
+        <w:rPr>
+          <w:lang w:val="es-CO"/>
+        </w:rPr>
+        <w:t>te</w:t>
+      </w:r>
+      <w:r>
+        <w:rPr>
+          <w:lang w:val="es-CO"/>
+        </w:rPr>
+        <w:t xml:space="preserve"> en Desarrollo de Software</w:t>
       </w:r>
     </w:p>
     <w:p>
@@ -1437,25 +1630,6 @@
           <w:lang w:val="es-CO"/>
         </w:rPr>
         <w:t>• Alta motivación para aprender automatización de pruebas y desarrollo de soluciones</w:t>
-      </w:r>
-    </w:p>
-    <w:p>
-      <w:pPr>
-        <w:pStyle w:val="Listaconvietas"/>
-        <w:numPr>
-          <w:ilvl w:val="0"/>
-          <w:numId w:val="0"/>
-        </w:numPr>
-        <w:ind w:left="360"/>
-        <w:rPr>
-          <w:lang w:val="es-CO"/>
-        </w:rPr>
-      </w:pPr>
-      <w:r>
-        <w:rPr>
-          <w:lang w:val="es-CO"/>
-        </w:rPr>
-        <w:t>• Interés en roles de desarrollo o automatización QA</w:t>
       </w:r>
     </w:p>
     <w:p>
@@ -2580,6 +2754,7 @@
   <w:style w:type="character" w:default="1" w:styleId="Fuentedeprrafopredeter">
     <w:name w:val="Default Paragraph Font"/>
     <w:uiPriority w:val="1"/>
+    <w:semiHidden/>
     <w:unhideWhenUsed/>
   </w:style>
   <w:style w:type="table" w:default="1" w:styleId="Tablanormal">

</xml_diff>

<commit_message>
Se agrega elproyecto Debora Sanabria Hair, con su imagen de fondo y el enlace a github
</commit_message>
<xml_diff>
--- a/static/CV_Junior_Dev_Kevin_Olivella.docx
+++ b/static/CV_Junior_Dev_Kevin_Olivella.docx
@@ -41,13 +41,9 @@
       </w:pPr>
       <w:r>
         <w:rPr>
-          <w:rFonts w:ascii="Segoe UI Emoji" w:hAnsi="Segoe UI Emoji" w:cs="Segoe UI Emoji"/>
-        </w:rPr>
-        <w:t>📍</w:t>
-      </w:r>
-      <w:r>
-        <w:rPr>
           <w:rFonts w:ascii="Arial" w:hAnsi="Arial" w:cs="Arial"/>
+          <w:b/>
+          <w:bCs/>
           <w:lang w:val="es-CO"/>
         </w:rPr>
         <w:t xml:space="preserve"> </w:t>
@@ -76,21 +72,8 @@
           <w:lang w:val="es-CO"/>
         </w:rPr>
         <w:br/>
-      </w:r>
-      <w:r>
-        <w:rPr>
-          <w:rFonts w:ascii="Segoe UI Emoji" w:hAnsi="Segoe UI Emoji" w:cs="Segoe UI Emoji"/>
-        </w:rPr>
-        <w:t>📧</w:t>
-      </w:r>
-      <w:r>
-        <w:rPr>
-          <w:rFonts w:ascii="Arial" w:hAnsi="Arial" w:cs="Arial"/>
-          <w:lang w:val="es-CO"/>
-        </w:rPr>
         <w:t xml:space="preserve"> </w:t>
       </w:r>
-      <w:proofErr w:type="gramStart"/>
       <w:r>
         <w:rPr>
           <w:rFonts w:ascii="Arial" w:hAnsi="Arial" w:cs="Arial"/>
@@ -109,15 +92,6 @@
       </w:r>
       <w:r>
         <w:rPr>
-          <w:rFonts w:ascii="Segoe UI Emoji" w:hAnsi="Segoe UI Emoji" w:cs="Segoe UI Emoji"/>
-          <w:b/>
-          <w:bCs/>
-        </w:rPr>
-        <w:t>📱</w:t>
-      </w:r>
-      <w:proofErr w:type="gramEnd"/>
-      <w:r>
-        <w:rPr>
           <w:rFonts w:ascii="Arial" w:hAnsi="Arial" w:cs="Arial"/>
           <w:b/>
           <w:bCs/>
@@ -130,7 +104,7 @@
           <w:rFonts w:ascii="Arial" w:hAnsi="Arial" w:cs="Arial"/>
           <w:lang w:val="es-CO"/>
         </w:rPr>
-        <w:t xml:space="preserve"> | </w:t>
+        <w:t xml:space="preserve"> </w:t>
       </w:r>
     </w:p>
     <w:p>
@@ -142,14 +116,6 @@
           <w:lang w:val="es-CO"/>
         </w:rPr>
       </w:pPr>
-      <w:r>
-        <w:rPr>
-          <w:rFonts w:ascii="Segoe UI Emoji" w:hAnsi="Segoe UI Emoji" w:cs="Segoe UI Emoji"/>
-          <w:b/>
-          <w:bCs/>
-        </w:rPr>
-        <w:t>💻</w:t>
-      </w:r>
       <w:r>
         <w:rPr>
           <w:rFonts w:ascii="Arial" w:hAnsi="Arial" w:cs="Arial"/>
@@ -192,14 +158,6 @@
       </w:pPr>
       <w:r>
         <w:rPr>
-          <w:rFonts w:ascii="Segoe UI Emoji" w:hAnsi="Segoe UI Emoji" w:cs="Segoe UI Emoji"/>
-          <w:b/>
-          <w:bCs/>
-        </w:rPr>
-        <w:t>💻</w:t>
-      </w:r>
-      <w:r>
-        <w:rPr>
           <w:rFonts w:ascii="Arial" w:hAnsi="Arial" w:cs="Arial"/>
           <w:b/>
           <w:bCs/>
@@ -249,45 +207,10 @@
         <w:rPr>
           <w:lang w:val="es-CO"/>
         </w:rPr>
-        <w:t xml:space="preserve">Desarrollador </w:t>
+        <w:t xml:space="preserve">Desarrollador Fullstack con experiencia en proyectos integradores que simulan entornos reales. </w:t>
       </w:r>
-      <w:proofErr w:type="spellStart"/>
       <w:r>
-        <w:rPr>
-          <w:lang w:val="es-CO"/>
-        </w:rPr>
-        <w:t>Fullstack</w:t>
-      </w:r>
-      <w:proofErr w:type="spellEnd"/>
-      <w:r>
-        <w:rPr>
-          <w:lang w:val="es-CO"/>
-        </w:rPr>
-        <w:t xml:space="preserve"> con experiencia en proyectos integradores que simulan entornos reales. </w:t>
-      </w:r>
-      <w:proofErr w:type="spellStart"/>
-      <w:r>
-        <w:t>Conocimientos</w:t>
-      </w:r>
-      <w:proofErr w:type="spellEnd"/>
-      <w:r>
-        <w:t xml:space="preserve"> </w:t>
-      </w:r>
-      <w:proofErr w:type="spellStart"/>
-      <w:r>
-        <w:t>sólidos</w:t>
-      </w:r>
-      <w:proofErr w:type="spellEnd"/>
-      <w:r>
-        <w:t xml:space="preserve"> </w:t>
-      </w:r>
-      <w:proofErr w:type="spellStart"/>
-      <w:r>
-        <w:t>en</w:t>
-      </w:r>
-      <w:proofErr w:type="spellEnd"/>
-      <w:r>
-        <w:t xml:space="preserve"> frontend (Angular, React, Tailwind, Bootstrap) y backend (Java</w:t>
+        <w:t>Conocimientos sólidos en frontend (Angular, React, Tailwind, Bootstrap) y backend (Java</w:t>
       </w:r>
       <w:r>
         <w:t>, ty</w:t>
@@ -299,15 +222,7 @@
         <w:t>, Spring Boot,</w:t>
       </w:r>
       <w:r>
-        <w:t xml:space="preserve"> </w:t>
-      </w:r>
-      <w:proofErr w:type="spellStart"/>
-      <w:r>
-        <w:t>NestJS</w:t>
-      </w:r>
-      <w:proofErr w:type="spellEnd"/>
-      <w:r>
-        <w:t>,</w:t>
+        <w:t xml:space="preserve"> NestJS,</w:t>
       </w:r>
       <w:r>
         <w:t xml:space="preserve"> Python, MySQL, PostgreSQL). </w:t>
@@ -328,35 +243,7 @@
         <w:rPr>
           <w:lang w:val="es-CO"/>
         </w:rPr>
-        <w:t xml:space="preserve">Experiencia en construcción de </w:t>
-      </w:r>
-      <w:proofErr w:type="spellStart"/>
-      <w:r>
-        <w:rPr>
-          <w:lang w:val="es-CO"/>
-        </w:rPr>
-        <w:t>CRUDs</w:t>
-      </w:r>
-      <w:proofErr w:type="spellEnd"/>
-      <w:r>
-        <w:rPr>
-          <w:lang w:val="es-CO"/>
-        </w:rPr>
-        <w:t xml:space="preserve">, autenticación con roles, desarrollo de </w:t>
-      </w:r>
-      <w:proofErr w:type="spellStart"/>
-      <w:r>
-        <w:rPr>
-          <w:lang w:val="es-CO"/>
-        </w:rPr>
-        <w:t>APIs</w:t>
-      </w:r>
-      <w:proofErr w:type="spellEnd"/>
-      <w:r>
-        <w:rPr>
-          <w:lang w:val="es-CO"/>
-        </w:rPr>
-        <w:t xml:space="preserve"> y despliegues en la nube. Busco aportar en equipos de desarrollo aportando soluciones escalables y de calidad.</w:t>
+        <w:t>Experiencia en construcción de CRUDs, autenticación con roles, desarrollo de APIs y despliegues en la nube. Busco aportar en equipos de desarrollo aportando soluciones escalables y de calidad.</w:t>
       </w:r>
     </w:p>
     <w:p>
@@ -386,7 +273,6 @@
           <w:lang w:val="es-CO"/>
         </w:rPr>
       </w:pPr>
-      <w:proofErr w:type="spellStart"/>
       <w:r>
         <w:rPr>
           <w:b/>
@@ -395,7 +281,6 @@
         </w:rPr>
         <w:t>Frontend</w:t>
       </w:r>
-      <w:proofErr w:type="spellEnd"/>
       <w:r>
         <w:rPr>
           <w:lang w:val="es-CO"/>
@@ -409,27 +294,21 @@
           <w:bCs/>
           <w:lang w:val="es-CO"/>
         </w:rPr>
-        <w:t>Angular 17 y 19</w:t>
+        <w:t>Angular 17</w:t>
+      </w:r>
+      <w:r>
+        <w:rPr>
+          <w:b/>
+          <w:bCs/>
+          <w:lang w:val="es-CO"/>
+        </w:rPr>
+        <w:t xml:space="preserve"> - 20</w:t>
       </w:r>
       <w:r>
         <w:rPr>
           <w:lang w:val="es-CO"/>
         </w:rPr>
-        <w:t xml:space="preserve">, con enfoque en componentes </w:t>
-      </w:r>
-      <w:proofErr w:type="spellStart"/>
-      <w:r>
-        <w:rPr>
-          <w:lang w:val="es-CO"/>
-        </w:rPr>
-        <w:t>standalone</w:t>
-      </w:r>
-      <w:proofErr w:type="spellEnd"/>
-      <w:r>
-        <w:rPr>
-          <w:lang w:val="es-CO"/>
-        </w:rPr>
-        <w:t>, rutas protegidas y servicios desacoplados</w:t>
+        <w:t>, con enfoque en componentes standalone, rutas protegidas y servicios desacoplados</w:t>
       </w:r>
       <w:r>
         <w:rPr>
@@ -438,7 +317,6 @@
         <w:br/>
         <w:t xml:space="preserve">• Uso de </w:t>
       </w:r>
-      <w:proofErr w:type="spellStart"/>
       <w:r>
         <w:rPr>
           <w:b/>
@@ -447,7 +325,6 @@
         </w:rPr>
         <w:t>PrimeNG</w:t>
       </w:r>
-      <w:proofErr w:type="spellEnd"/>
       <w:r>
         <w:rPr>
           <w:b/>
@@ -490,7 +367,6 @@
         <w:br/>
         <w:t xml:space="preserve">• Conocimientos prácticos en </w:t>
       </w:r>
-      <w:proofErr w:type="spellStart"/>
       <w:r>
         <w:rPr>
           <w:b/>
@@ -499,54 +375,11 @@
         </w:rPr>
         <w:t>React</w:t>
       </w:r>
-      <w:proofErr w:type="spellEnd"/>
       <w:r>
         <w:rPr>
           <w:lang w:val="es-CO"/>
         </w:rPr>
-        <w:t xml:space="preserve"> con componentes funcionales y </w:t>
-      </w:r>
-      <w:proofErr w:type="spellStart"/>
-      <w:r>
-        <w:rPr>
-          <w:lang w:val="es-CO"/>
-        </w:rPr>
-        <w:t>hooks</w:t>
-      </w:r>
-      <w:proofErr w:type="spellEnd"/>
-      <w:r>
-        <w:rPr>
-          <w:lang w:val="es-CO"/>
-        </w:rPr>
-        <w:t xml:space="preserve"> (</w:t>
-      </w:r>
-      <w:proofErr w:type="spellStart"/>
-      <w:r>
-        <w:rPr>
-          <w:lang w:val="es-CO"/>
-        </w:rPr>
-        <w:t>useState</w:t>
-      </w:r>
-      <w:proofErr w:type="spellEnd"/>
-      <w:r>
-        <w:rPr>
-          <w:lang w:val="es-CO"/>
-        </w:rPr>
-        <w:t xml:space="preserve">, </w:t>
-      </w:r>
-      <w:proofErr w:type="spellStart"/>
-      <w:r>
-        <w:rPr>
-          <w:lang w:val="es-CO"/>
-        </w:rPr>
-        <w:t>useEffect</w:t>
-      </w:r>
-      <w:proofErr w:type="spellEnd"/>
-      <w:r>
-        <w:rPr>
-          <w:lang w:val="es-CO"/>
-        </w:rPr>
-        <w:t>)</w:t>
+        <w:t xml:space="preserve"> con componentes funcionales y hooks (useState, useEffect)</w:t>
       </w:r>
       <w:r>
         <w:rPr>
@@ -567,16 +400,8 @@
         <w:rPr>
           <w:lang w:val="es-CO"/>
         </w:rPr>
-        <w:t xml:space="preserve"> y principios de diseño responsivo usando Bootstrap y </w:t>
+        <w:t xml:space="preserve"> y principios de diseño responsivo usando Bootstrap y Tailwind</w:t>
       </w:r>
-      <w:proofErr w:type="spellStart"/>
-      <w:r>
-        <w:rPr>
-          <w:lang w:val="es-CO"/>
-        </w:rPr>
-        <w:t>Tailwind</w:t>
-      </w:r>
-      <w:proofErr w:type="spellEnd"/>
     </w:p>
     <w:p>
       <w:pPr>
@@ -589,7 +414,6 @@
           <w:lang w:val="es-CO"/>
         </w:rPr>
       </w:pPr>
-      <w:proofErr w:type="spellStart"/>
       <w:r>
         <w:rPr>
           <w:b/>
@@ -598,41 +422,12 @@
         </w:rPr>
         <w:t>Backend</w:t>
       </w:r>
-      <w:proofErr w:type="spellEnd"/>
       <w:r>
         <w:rPr>
           <w:lang w:val="es-CO"/>
         </w:rPr>
         <w:br/>
-        <w:t xml:space="preserve">• Construcción de </w:t>
-      </w:r>
-      <w:proofErr w:type="spellStart"/>
-      <w:r>
-        <w:rPr>
-          <w:lang w:val="es-CO"/>
-        </w:rPr>
-        <w:t>APIs</w:t>
-      </w:r>
-      <w:proofErr w:type="spellEnd"/>
-      <w:r>
-        <w:rPr>
-          <w:lang w:val="es-CO"/>
-        </w:rPr>
-        <w:t xml:space="preserve"> </w:t>
-      </w:r>
-      <w:proofErr w:type="spellStart"/>
-      <w:r>
-        <w:rPr>
-          <w:lang w:val="es-CO"/>
-        </w:rPr>
-        <w:t>RESTful</w:t>
-      </w:r>
-      <w:proofErr w:type="spellEnd"/>
-      <w:r>
-        <w:rPr>
-          <w:lang w:val="es-CO"/>
-        </w:rPr>
-        <w:t xml:space="preserve"> usando </w:t>
+        <w:t xml:space="preserve">• Construcción de APIs RESTful usando </w:t>
       </w:r>
       <w:r>
         <w:rPr>
@@ -640,18 +435,8 @@
           <w:bCs/>
           <w:lang w:val="es-CO"/>
         </w:rPr>
-        <w:t xml:space="preserve">Spring </w:t>
+        <w:t>Spring Boot</w:t>
       </w:r>
-      <w:proofErr w:type="spellStart"/>
-      <w:r>
-        <w:rPr>
-          <w:b/>
-          <w:bCs/>
-          <w:lang w:val="es-CO"/>
-        </w:rPr>
-        <w:t>Boot</w:t>
-      </w:r>
-      <w:proofErr w:type="spellEnd"/>
       <w:r>
         <w:rPr>
           <w:lang w:val="es-CO"/>
@@ -662,21 +447,7 @@
         <w:rPr>
           <w:lang w:val="es-CO"/>
         </w:rPr>
-        <w:t xml:space="preserve">y </w:t>
-      </w:r>
-      <w:proofErr w:type="spellStart"/>
-      <w:r>
-        <w:rPr>
-          <w:lang w:val="es-CO"/>
-        </w:rPr>
-        <w:t>NestJS</w:t>
-      </w:r>
-      <w:proofErr w:type="spellEnd"/>
-      <w:r>
-        <w:rPr>
-          <w:lang w:val="es-CO"/>
-        </w:rPr>
-        <w:t xml:space="preserve"> </w:t>
+        <w:t xml:space="preserve">y NestJS </w:t>
       </w:r>
       <w:r>
         <w:rPr>
@@ -703,21 +474,7 @@
         <w:rPr>
           <w:lang w:val="es-CO"/>
         </w:rPr>
-        <w:t xml:space="preserve"> y uso de JPA con </w:t>
-      </w:r>
-      <w:proofErr w:type="spellStart"/>
-      <w:r>
-        <w:rPr>
-          <w:lang w:val="es-CO"/>
-        </w:rPr>
-        <w:t>Hibernate</w:t>
-      </w:r>
-      <w:proofErr w:type="spellEnd"/>
-      <w:r>
-        <w:rPr>
-          <w:lang w:val="es-CO"/>
-        </w:rPr>
-        <w:t xml:space="preserve"> para persistencia de datos</w:t>
+        <w:t xml:space="preserve"> y uso de JPA con Hibernate para persistencia de datos</w:t>
       </w:r>
       <w:r>
         <w:rPr>
@@ -794,16 +551,8 @@
         <w:rPr>
           <w:lang w:val="es-CO"/>
         </w:rPr>
-        <w:t xml:space="preserve">, GitHub y Visual Studio </w:t>
+        <w:t>, GitHub y Visual Studio Code</w:t>
       </w:r>
-      <w:proofErr w:type="spellStart"/>
-      <w:r>
-        <w:rPr>
-          <w:lang w:val="es-CO"/>
-        </w:rPr>
-        <w:t>Code</w:t>
-      </w:r>
-      <w:proofErr w:type="spellEnd"/>
       <w:r>
         <w:rPr>
           <w:lang w:val="es-CO"/>
@@ -823,16 +572,8 @@
         <w:rPr>
           <w:lang w:val="es-CO"/>
         </w:rPr>
-        <w:t xml:space="preserve">, uso de ramas y gestión de </w:t>
+        <w:t>, uso de ramas y gestión de merges</w:t>
       </w:r>
-      <w:proofErr w:type="spellStart"/>
-      <w:r>
-        <w:rPr>
-          <w:lang w:val="es-CO"/>
-        </w:rPr>
-        <w:t>merges</w:t>
-      </w:r>
-      <w:proofErr w:type="spellEnd"/>
     </w:p>
     <w:p>
       <w:pPr>
@@ -874,49 +615,7 @@
         <w:rPr>
           <w:lang w:val="es-CO"/>
         </w:rPr>
-        <w:t xml:space="preserve">Nexus API – Plataforma </w:t>
-      </w:r>
-      <w:proofErr w:type="spellStart"/>
-      <w:r>
-        <w:rPr>
-          <w:lang w:val="es-CO"/>
-        </w:rPr>
-        <w:t>backend</w:t>
-      </w:r>
-      <w:proofErr w:type="spellEnd"/>
-      <w:r>
-        <w:rPr>
-          <w:lang w:val="es-CO"/>
-        </w:rPr>
-        <w:t xml:space="preserve"> multipropósito Tecnologías: </w:t>
-      </w:r>
-      <w:proofErr w:type="spellStart"/>
-      <w:r>
-        <w:rPr>
-          <w:lang w:val="es-CO"/>
-        </w:rPr>
-        <w:t>NestJS</w:t>
-      </w:r>
-      <w:proofErr w:type="spellEnd"/>
-      <w:r>
-        <w:rPr>
-          <w:lang w:val="es-CO"/>
-        </w:rPr>
-        <w:t xml:space="preserve">, </w:t>
-      </w:r>
-      <w:proofErr w:type="spellStart"/>
-      <w:r>
-        <w:rPr>
-          <w:lang w:val="es-CO"/>
-        </w:rPr>
-        <w:t>TypeScript</w:t>
-      </w:r>
-      <w:proofErr w:type="spellEnd"/>
-      <w:r>
-        <w:rPr>
-          <w:lang w:val="es-CO"/>
-        </w:rPr>
-        <w:t>, Prisma ORM</w:t>
+        <w:t>Nexus API – Plataforma backend multipropósito Tecnologías: NestJS, TypeScript, Prisma ORM</w:t>
       </w:r>
     </w:p>
     <w:p>
@@ -950,35 +649,7 @@
         <w:rPr>
           <w:lang w:val="es-CO"/>
         </w:rPr>
-        <w:t xml:space="preserve">Conexión e integración con una aplicación de gestión de clientes construida con Angular (CRUD) y </w:t>
-      </w:r>
-      <w:proofErr w:type="spellStart"/>
-      <w:r>
-        <w:rPr>
-          <w:lang w:val="es-CO"/>
-        </w:rPr>
-        <w:t>Facturacion</w:t>
-      </w:r>
-      <w:proofErr w:type="spellEnd"/>
-      <w:r>
-        <w:rPr>
-          <w:lang w:val="es-CO"/>
-        </w:rPr>
-        <w:t xml:space="preserve"> en </w:t>
-      </w:r>
-      <w:proofErr w:type="spellStart"/>
-      <w:r>
-        <w:rPr>
-          <w:lang w:val="es-CO"/>
-        </w:rPr>
-        <w:t>React</w:t>
-      </w:r>
-      <w:proofErr w:type="spellEnd"/>
-      <w:r>
-        <w:rPr>
-          <w:lang w:val="es-CO"/>
-        </w:rPr>
-        <w:t>.</w:t>
+        <w:t>Conexión e integración con una aplicación de gestión de clientes construida con Angular (CRUD) y Facturacion en React.</w:t>
       </w:r>
     </w:p>
     <w:p>
@@ -1042,77 +713,7 @@
         <w:rPr>
           <w:lang w:val="es-CO"/>
         </w:rPr>
-        <w:t xml:space="preserve">Tienda Virtual – Plataforma de compras en línea con pasarela de pagos Tecnologías: </w:t>
-      </w:r>
-      <w:proofErr w:type="spellStart"/>
-      <w:r>
-        <w:rPr>
-          <w:lang w:val="es-CO"/>
-        </w:rPr>
-        <w:t>Typescript</w:t>
-      </w:r>
-      <w:proofErr w:type="spellEnd"/>
-      <w:r>
-        <w:rPr>
-          <w:lang w:val="es-CO"/>
-        </w:rPr>
-        <w:t xml:space="preserve">, </w:t>
-      </w:r>
-      <w:proofErr w:type="spellStart"/>
-      <w:r>
-        <w:rPr>
-          <w:lang w:val="es-CO"/>
-        </w:rPr>
-        <w:t>Javascrip</w:t>
-      </w:r>
-      <w:proofErr w:type="spellEnd"/>
-      <w:r>
-        <w:rPr>
-          <w:lang w:val="es-CO"/>
-        </w:rPr>
-        <w:t xml:space="preserve">, </w:t>
-      </w:r>
-      <w:proofErr w:type="spellStart"/>
-      <w:r>
-        <w:rPr>
-          <w:lang w:val="es-CO"/>
-        </w:rPr>
-        <w:t>NestJS</w:t>
-      </w:r>
-      <w:proofErr w:type="spellEnd"/>
-      <w:r>
-        <w:rPr>
-          <w:lang w:val="es-CO"/>
-        </w:rPr>
-        <w:t xml:space="preserve">, </w:t>
-      </w:r>
-      <w:proofErr w:type="spellStart"/>
-      <w:r>
-        <w:rPr>
-          <w:lang w:val="es-CO"/>
-        </w:rPr>
-        <w:t>React</w:t>
-      </w:r>
-      <w:proofErr w:type="spellEnd"/>
-      <w:r>
-        <w:rPr>
-          <w:lang w:val="es-CO"/>
-        </w:rPr>
-        <w:t xml:space="preserve">, Vite, PostgreSQL, </w:t>
-      </w:r>
-      <w:proofErr w:type="spellStart"/>
-      <w:r>
-        <w:rPr>
-          <w:lang w:val="es-CO"/>
-        </w:rPr>
-        <w:t>Tailwind</w:t>
-      </w:r>
-      <w:proofErr w:type="spellEnd"/>
-      <w:r>
-        <w:rPr>
-          <w:lang w:val="es-CO"/>
-        </w:rPr>
-        <w:t xml:space="preserve"> CSS.</w:t>
+        <w:t>Tienda Virtual – Plataforma de compras en línea con pasarela de pagos Tecnologías: Typescript, Javascrip, NestJS, React, Vite, PostgreSQL, Tailwind CSS.</w:t>
       </w:r>
     </w:p>
     <w:p>
@@ -1129,63 +730,7 @@
         <w:rPr>
           <w:lang w:val="es-CO"/>
         </w:rPr>
-        <w:t xml:space="preserve"> Desarrollo </w:t>
-      </w:r>
-      <w:proofErr w:type="spellStart"/>
-      <w:r>
-        <w:rPr>
-          <w:lang w:val="es-CO"/>
-        </w:rPr>
-        <w:t>fullstack</w:t>
-      </w:r>
-      <w:proofErr w:type="spellEnd"/>
-      <w:r>
-        <w:rPr>
-          <w:lang w:val="es-CO"/>
-        </w:rPr>
-        <w:t xml:space="preserve"> con integración a </w:t>
-      </w:r>
-      <w:proofErr w:type="spellStart"/>
-      <w:r>
-        <w:rPr>
-          <w:lang w:val="es-CO"/>
-        </w:rPr>
-        <w:t>Wompi</w:t>
-      </w:r>
-      <w:proofErr w:type="spellEnd"/>
-      <w:r>
-        <w:rPr>
-          <w:lang w:val="es-CO"/>
-        </w:rPr>
-        <w:t xml:space="preserve"> en modo </w:t>
-      </w:r>
-      <w:proofErr w:type="spellStart"/>
-      <w:r>
-        <w:rPr>
-          <w:lang w:val="es-CO"/>
-        </w:rPr>
-        <w:t>sandbox</w:t>
-      </w:r>
-      <w:proofErr w:type="spellEnd"/>
-      <w:r>
-        <w:rPr>
-          <w:lang w:val="es-CO"/>
-        </w:rPr>
-        <w:t xml:space="preserve"> </w:t>
-      </w:r>
-      <w:proofErr w:type="gramStart"/>
-      <w:r>
-        <w:rPr>
-          <w:lang w:val="es-CO"/>
-        </w:rPr>
-        <w:t>-  Registro</w:t>
-      </w:r>
-      <w:proofErr w:type="gramEnd"/>
-      <w:r>
-        <w:rPr>
-          <w:lang w:val="es-CO"/>
-        </w:rPr>
-        <w:t xml:space="preserve"> y visualización de transacciones en tiempo real</w:t>
+        <w:t> Desarrollo fullstack con integración a Wompi en modo sandbox -  Registro y visualización de transacciones en tiempo real</w:t>
       </w:r>
     </w:p>
     <w:p>
@@ -1202,127 +747,21 @@
         <w:rPr>
           <w:lang w:val="es-CO"/>
         </w:rPr>
-        <w:t xml:space="preserve">Interfaz responsive con experiencia de usuario optimizada </w:t>
+        <w:t>Interfaz responsive con experiencia de usuario optimizada -  Implementación de pagos simulados, validación de tarjetas y resúmenes de compra -  Despliegue en Vercel y Netlify (frontend) y Render (backend), con pruebas automatizadas  </w:t>
       </w:r>
-      <w:proofErr w:type="gramStart"/>
+    </w:p>
+    <w:p>
+      <w:pPr>
+        <w:rPr>
+          <w:lang w:val="es-CO"/>
+        </w:rPr>
+      </w:pPr>
       <w:r>
         <w:rPr>
           <w:lang w:val="es-CO"/>
         </w:rPr>
-        <w:t>-  Implementación</w:t>
+        <w:t>Educación Técnico laboral por competencias en Asistente en Desarrollo de Software Cesde, Sede Bello, Antioquia Certificaciones:  -Curso de Scrum – Platzi</w:t>
       </w:r>
-      <w:proofErr w:type="gramEnd"/>
-      <w:r>
-        <w:rPr>
-          <w:lang w:val="es-CO"/>
-        </w:rPr>
-        <w:t xml:space="preserve"> de pagos simulados, validación de tarjetas y resúmenes de compra </w:t>
-      </w:r>
-      <w:proofErr w:type="gramStart"/>
-      <w:r>
-        <w:rPr>
-          <w:lang w:val="es-CO"/>
-        </w:rPr>
-        <w:t>-  Despliegue</w:t>
-      </w:r>
-      <w:proofErr w:type="gramEnd"/>
-      <w:r>
-        <w:rPr>
-          <w:lang w:val="es-CO"/>
-        </w:rPr>
-        <w:t xml:space="preserve"> en </w:t>
-      </w:r>
-      <w:proofErr w:type="spellStart"/>
-      <w:r>
-        <w:rPr>
-          <w:lang w:val="es-CO"/>
-        </w:rPr>
-        <w:t>Vercel</w:t>
-      </w:r>
-      <w:proofErr w:type="spellEnd"/>
-      <w:r>
-        <w:rPr>
-          <w:lang w:val="es-CO"/>
-        </w:rPr>
-        <w:t xml:space="preserve"> y </w:t>
-      </w:r>
-      <w:proofErr w:type="spellStart"/>
-      <w:r>
-        <w:rPr>
-          <w:lang w:val="es-CO"/>
-        </w:rPr>
-        <w:t>Netlify</w:t>
-      </w:r>
-      <w:proofErr w:type="spellEnd"/>
-      <w:r>
-        <w:rPr>
-          <w:lang w:val="es-CO"/>
-        </w:rPr>
-        <w:t xml:space="preserve"> (</w:t>
-      </w:r>
-      <w:proofErr w:type="spellStart"/>
-      <w:r>
-        <w:rPr>
-          <w:lang w:val="es-CO"/>
-        </w:rPr>
-        <w:t>frontend</w:t>
-      </w:r>
-      <w:proofErr w:type="spellEnd"/>
-      <w:r>
-        <w:rPr>
-          <w:lang w:val="es-CO"/>
-        </w:rPr>
-        <w:t>) y Render (</w:t>
-      </w:r>
-      <w:proofErr w:type="spellStart"/>
-      <w:r>
-        <w:rPr>
-          <w:lang w:val="es-CO"/>
-        </w:rPr>
-        <w:t>backend</w:t>
-      </w:r>
-      <w:proofErr w:type="spellEnd"/>
-      <w:r>
-        <w:rPr>
-          <w:lang w:val="es-CO"/>
-        </w:rPr>
-        <w:t>), con pruebas automatizadas  </w:t>
-      </w:r>
-    </w:p>
-    <w:p>
-      <w:pPr>
-        <w:rPr>
-          <w:lang w:val="es-CO"/>
-        </w:rPr>
-      </w:pPr>
-      <w:r>
-        <w:rPr>
-          <w:lang w:val="es-CO"/>
-        </w:rPr>
-        <w:t xml:space="preserve">Educación Técnico laboral por competencias en Asistente en Desarrollo de Software </w:t>
-      </w:r>
-      <w:proofErr w:type="spellStart"/>
-      <w:r>
-        <w:rPr>
-          <w:lang w:val="es-CO"/>
-        </w:rPr>
-        <w:t>Cesde</w:t>
-      </w:r>
-      <w:proofErr w:type="spellEnd"/>
-      <w:r>
-        <w:rPr>
-          <w:lang w:val="es-CO"/>
-        </w:rPr>
-        <w:t xml:space="preserve">, Sede Bello, Antioquia Certificaciones:  -Curso de Scrum – </w:t>
-      </w:r>
-      <w:proofErr w:type="spellStart"/>
-      <w:r>
-        <w:rPr>
-          <w:lang w:val="es-CO"/>
-        </w:rPr>
-        <w:t>Platzi</w:t>
-      </w:r>
-      <w:proofErr w:type="spellEnd"/>
     </w:p>
     <w:p>
       <w:pPr>
@@ -1338,21 +777,7 @@
         <w:rPr>
           <w:lang w:val="es-CO"/>
         </w:rPr>
-        <w:t>Curso de HTML y CSS –</w:t>
-      </w:r>
-      <w:proofErr w:type="spellStart"/>
-      <w:r>
-        <w:rPr>
-          <w:lang w:val="es-CO"/>
-        </w:rPr>
-        <w:t>Platzi</w:t>
-      </w:r>
-      <w:proofErr w:type="spellEnd"/>
-      <w:r>
-        <w:rPr>
-          <w:lang w:val="es-CO"/>
-        </w:rPr>
-        <w:t xml:space="preserve"> </w:t>
+        <w:t xml:space="preserve">Curso de HTML y CSS –Platzi </w:t>
       </w:r>
     </w:p>
     <w:p>
@@ -1369,30 +794,8 @@
         <w:rPr>
           <w:lang w:val="es-CO"/>
         </w:rPr>
-        <w:t xml:space="preserve">Curso de Scrum y Scrum </w:t>
+        <w:t>Curso de Scrum y Scrum Master en Platzi</w:t>
       </w:r>
-      <w:proofErr w:type="gramStart"/>
-      <w:r>
-        <w:rPr>
-          <w:lang w:val="es-CO"/>
-        </w:rPr>
-        <w:t>Master</w:t>
-      </w:r>
-      <w:proofErr w:type="gramEnd"/>
-      <w:r>
-        <w:rPr>
-          <w:lang w:val="es-CO"/>
-        </w:rPr>
-        <w:t xml:space="preserve"> en </w:t>
-      </w:r>
-      <w:proofErr w:type="spellStart"/>
-      <w:r>
-        <w:rPr>
-          <w:lang w:val="es-CO"/>
-        </w:rPr>
-        <w:t>Platzi</w:t>
-      </w:r>
-      <w:proofErr w:type="spellEnd"/>
     </w:p>
     <w:p>
       <w:pPr>
@@ -1408,30 +811,8 @@
         <w:rPr>
           <w:lang w:val="es-CO"/>
         </w:rPr>
-        <w:t xml:space="preserve">Curso de </w:t>
+        <w:t>Curso de React - Platzi</w:t>
       </w:r>
-      <w:proofErr w:type="spellStart"/>
-      <w:r>
-        <w:rPr>
-          <w:lang w:val="es-CO"/>
-        </w:rPr>
-        <w:t>React</w:t>
-      </w:r>
-      <w:proofErr w:type="spellEnd"/>
-      <w:r>
-        <w:rPr>
-          <w:lang w:val="es-CO"/>
-        </w:rPr>
-        <w:t xml:space="preserve"> - </w:t>
-      </w:r>
-      <w:proofErr w:type="spellStart"/>
-      <w:r>
-        <w:rPr>
-          <w:lang w:val="es-CO"/>
-        </w:rPr>
-        <w:t>Platzi</w:t>
-      </w:r>
-      <w:proofErr w:type="spellEnd"/>
     </w:p>
     <w:p>
       <w:pPr>
@@ -3010,6 +2391,7 @@
   <w:style w:type="character" w:default="1" w:styleId="Fuentedeprrafopredeter">
     <w:name w:val="Default Paragraph Font"/>
     <w:uiPriority w:val="1"/>
+    <w:semiHidden/>
     <w:unhideWhenUsed/>
   </w:style>
   <w:style w:type="table" w:default="1" w:styleId="Tablanormal">

</xml_diff>